<commit_message>
fix: comparison template uses {d.details} single field (same as brochure)
Carbone v3 doesn't support {.field} inside {#} loop blocks.
Changed comparison to the same proven pattern as brochure:
- Template: single {d.details} field instead of array loop
- Tool: formats properties array as readable text block
- server.js: maps property objects to formatted details string

All 3 templates now use consistent {d.field} simple tags.
</commit_message>
<xml_diff>
--- a/ai-server/templates/comparison.docx
+++ b/ai-server/templates/comparison.docx
@@ -19,96 +19,9 @@
       </w:r>
     </w:p>
     <w:p>
-      <w:r>
-        <w:rPr>
-          <w:rFonts w:ascii="Calibri" w:cs="Calibri" w:eastAsia="Calibri" w:hAnsi="Calibri"/>
-          <w:color w:val="FFFFFF"/>
-          <w:sz w:val="1"/>
-          <w:szCs w:val="1"/>
-        </w:rPr>
-        <w:t xml:space="preserve">{#d.properties}</w:t>
-      </w:r>
-    </w:p>
-    <w:p>
-      <w:pPr>
-        <w:spacing w:after="80" w:before="200"/>
-      </w:pPr>
-      <w:r>
-        <w:rPr>
-          <w:rFonts w:ascii="Calibri" w:cs="Calibri" w:eastAsia="Calibri" w:hAnsi="Calibri"/>
-          <w:b/>
-          <w:bCs/>
-          <w:color w:val="1A4175"/>
-          <w:sz w:val="22"/>
-          <w:szCs w:val="22"/>
-        </w:rPr>
-        <w:t xml:space="preserve">─── </w:t>
-      </w:r>
-      <w:r>
-        <w:rPr>
-          <w:rFonts w:ascii="Calibri" w:cs="Calibri" w:eastAsia="Calibri" w:hAnsi="Calibri"/>
-          <w:b/>
-          <w:bCs/>
-          <w:color w:val="1A4175"/>
-          <w:sz w:val="28"/>
-          <w:szCs w:val="28"/>
-        </w:rPr>
-        <w:t xml:space="preserve">{.name}</w:t>
-      </w:r>
-      <w:r>
-        <w:rPr>
-          <w:rFonts w:ascii="Calibri" w:cs="Calibri" w:eastAsia="Calibri" w:hAnsi="Calibri"/>
-          <w:b/>
-          <w:bCs/>
-          <w:color w:val="1A4175"/>
-          <w:sz w:val="22"/>
-          <w:szCs w:val="22"/>
-        </w:rPr>
-        <w:t xml:space="preserve"> ───</w:t>
-      </w:r>
-    </w:p>
-    <w:p>
-      <w:pPr>
-        <w:spacing w:after="60"/>
-      </w:pPr>
-      <w:r>
-        <w:rPr>
-          <w:rFonts w:ascii="Calibri" w:cs="Calibri" w:eastAsia="Calibri" w:hAnsi="Calibri"/>
-          <w:b/>
-          <w:bCs/>
-          <w:color w:val="1A4175"/>
-          <w:sz w:val="22"/>
-          <w:szCs w:val="22"/>
-        </w:rPr>
-        <w:t xml:space="preserve">Price: </w:t>
-      </w:r>
-      <w:r>
-        <w:rPr>
-          <w:rFonts w:ascii="Calibri" w:cs="Calibri" w:eastAsia="Calibri" w:hAnsi="Calibri"/>
-          <w:b/>
-          <w:bCs/>
-          <w:color w:val="941D28"/>
-          <w:sz w:val="22"/>
-          <w:szCs w:val="22"/>
-        </w:rPr>
-        <w:t xml:space="preserve">{.price}</w:t>
-      </w:r>
-    </w:p>
-    <w:p>
-      <w:pPr>
-        <w:spacing w:after="60"/>
-      </w:pPr>
-      <w:r>
-        <w:rPr>
-          <w:rFonts w:ascii="Calibri" w:cs="Calibri" w:eastAsia="Calibri" w:hAnsi="Calibri"/>
-          <w:b/>
-          <w:bCs/>
-          <w:color w:val="1A4175"/>
-          <w:sz w:val="22"/>
-          <w:szCs w:val="22"/>
-        </w:rPr>
-        <w:t xml:space="preserve">Specifications: </w:t>
-      </w:r>
+      <w:pPr>
+        <w:spacing w:after="80"/>
+      </w:pPr>
       <w:r>
         <w:rPr>
           <w:rFonts w:ascii="Calibri" w:cs="Calibri" w:eastAsia="Calibri" w:hAnsi="Calibri"/>
@@ -116,57 +29,7 @@
           <w:sz w:val="22"/>
           <w:szCs w:val="22"/>
         </w:rPr>
-        <w:t xml:space="preserve">{.specs}</w:t>
-      </w:r>
-    </w:p>
-    <w:p>
-      <w:pPr>
-        <w:spacing w:after="60"/>
-      </w:pPr>
-      <w:r>
-        <w:rPr>
-          <w:rFonts w:ascii="Calibri" w:cs="Calibri" w:eastAsia="Calibri" w:hAnsi="Calibri"/>
-          <w:b/>
-          <w:bCs/>
-          <w:color w:val="228B22"/>
-          <w:sz w:val="22"/>
-          <w:szCs w:val="22"/>
-        </w:rPr>
-        <w:t xml:space="preserve">✅ Pros: </w:t>
-      </w:r>
-      <w:r>
-        <w:rPr>
-          <w:rFonts w:ascii="Calibri" w:cs="Calibri" w:eastAsia="Calibri" w:hAnsi="Calibri"/>
-          <w:color w:val="1A1A1A"/>
-          <w:sz w:val="22"/>
-          <w:szCs w:val="22"/>
-        </w:rPr>
-        <w:t xml:space="preserve">{.pros}</w:t>
-      </w:r>
-    </w:p>
-    <w:p>
-      <w:pPr>
-        <w:spacing w:after="60"/>
-      </w:pPr>
-      <w:r>
-        <w:rPr>
-          <w:rFonts w:ascii="Calibri" w:cs="Calibri" w:eastAsia="Calibri" w:hAnsi="Calibri"/>
-          <w:b/>
-          <w:bCs/>
-          <w:color w:val="941D28"/>
-          <w:sz w:val="22"/>
-          <w:szCs w:val="22"/>
-        </w:rPr>
-        <w:t xml:space="preserve">❌ Cons: </w:t>
-      </w:r>
-      <w:r>
-        <w:rPr>
-          <w:rFonts w:ascii="Calibri" w:cs="Calibri" w:eastAsia="Calibri" w:hAnsi="Calibri"/>
-          <w:color w:val="1A1A1A"/>
-          <w:sz w:val="22"/>
-          <w:szCs w:val="22"/>
-        </w:rPr>
-        <w:t xml:space="preserve">{.cons}</w:t>
+        <w:t xml:space="preserve">{d.details}</w:t>
       </w:r>
     </w:p>
     <w:p>
@@ -176,17 +39,6 @@
         </w:pBdr>
         <w:spacing w:after="120" w:before="120"/>
       </w:pPr>
-    </w:p>
-    <w:p>
-      <w:r>
-        <w:rPr>
-          <w:rFonts w:ascii="Calibri" w:cs="Calibri" w:eastAsia="Calibri" w:hAnsi="Calibri"/>
-          <w:color w:val="FFFFFF"/>
-          <w:sz w:val="1"/>
-          <w:szCs w:val="1"/>
-        </w:rPr>
-        <w:t xml:space="preserve">{/d.properties}</w:t>
-      </w:r>
     </w:p>
     <w:p>
       <w:pPr>

</xml_diff>